<commit_message>
Updates based on 2025.09
</commit_message>
<xml_diff>
--- a/documents/2025-features.docx
+++ b/documents/2025-features.docx
@@ -11,12 +11,21 @@
           <w:szCs w:val="20"/>
         </w:rPr>
       </w:pPr>
+      <w:proofErr w:type="spellStart"/>
       <w:r>
         <w:rPr>
           <w:b/>
           <w:sz w:val="56"/>
         </w:rPr>
-        <w:t>ResInsight User Course</w:t>
+        <w:t>ResInsight</w:t>
+      </w:r>
+      <w:proofErr w:type="spellEnd"/>
+      <w:r>
+        <w:rPr>
+          <w:b/>
+          <w:sz w:val="56"/>
+        </w:rPr>
+        <w:t xml:space="preserve"> User Course</w:t>
       </w:r>
       <w:r>
         <w:rPr>
@@ -133,11 +142,19 @@
           <w:docGrid w:linePitch="360"/>
         </w:sectPr>
       </w:pPr>
+      <w:proofErr w:type="spellStart"/>
       <w:r>
         <w:rPr>
           <w:sz w:val="28"/>
         </w:rPr>
-        <w:t xml:space="preserve">ResInsight </w:t>
+        <w:t>ResInsight</w:t>
+      </w:r>
+      <w:proofErr w:type="spellEnd"/>
+      <w:r>
+        <w:rPr>
+          <w:sz w:val="28"/>
+        </w:rPr>
+        <w:t xml:space="preserve"> </w:t>
       </w:r>
       <w:r>
         <w:rPr>
@@ -447,7 +464,7 @@
           <w:noProof/>
         </w:rPr>
         <w:drawing>
-          <wp:anchor distT="0" distB="0" distL="114300" distR="114300" simplePos="0" relativeHeight="251682816" behindDoc="0" locked="0" layoutInCell="1" allowOverlap="1" wp14:anchorId="12E51BFB" wp14:editId="14A19CA3">
+          <wp:anchor distT="0" distB="0" distL="114300" distR="114300" simplePos="0" relativeHeight="251682816" behindDoc="0" locked="0" layoutInCell="1" allowOverlap="1" wp14:anchorId="12E51BFB" wp14:editId="02513466">
             <wp:simplePos x="0" y="0"/>
             <wp:positionH relativeFrom="column">
               <wp:posOffset>6261633</wp:posOffset>
@@ -1005,7 +1022,23 @@
           <w:b/>
           <w:bCs/>
         </w:rPr>
-        <w:t>“model-data/drogon-varying-grid-geometry”</w:t>
+        <w:t>“model-data/</w:t>
+      </w:r>
+      <w:proofErr w:type="spellStart"/>
+      <w:r>
+        <w:rPr>
+          <w:b/>
+          <w:bCs/>
+        </w:rPr>
+        <w:t>drogon</w:t>
+      </w:r>
+      <w:proofErr w:type="spellEnd"/>
+      <w:r>
+        <w:rPr>
+          <w:b/>
+          <w:bCs/>
+        </w:rPr>
+        <w:t>-varying-grid-geometry”</w:t>
       </w:r>
       <w:r>
         <w:t xml:space="preserve">, and press </w:t>
@@ -1104,7 +1137,7 @@
           <w:noProof/>
         </w:rPr>
         <w:drawing>
-          <wp:anchor distT="0" distB="0" distL="114300" distR="114300" simplePos="0" relativeHeight="251683840" behindDoc="1" locked="0" layoutInCell="1" allowOverlap="1" wp14:anchorId="5D648471" wp14:editId="362A6CED">
+          <wp:anchor distT="0" distB="0" distL="114300" distR="114300" simplePos="0" relativeHeight="251683840" behindDoc="1" locked="0" layoutInCell="1" allowOverlap="1" wp14:anchorId="5D648471" wp14:editId="21562EE1">
             <wp:simplePos x="0" y="0"/>
             <wp:positionH relativeFrom="margin">
               <wp:align>right</wp:align>
@@ -1248,7 +1281,23 @@
           <w:b/>
           <w:bCs/>
         </w:rPr>
-        <w:t>“Create Polygon From Contour Map”</w:t>
+        <w:t xml:space="preserve">“Create Polygon </w:t>
+      </w:r>
+      <w:proofErr w:type="gramStart"/>
+      <w:r>
+        <w:rPr>
+          <w:b/>
+          <w:bCs/>
+        </w:rPr>
+        <w:t>From</w:t>
+      </w:r>
+      <w:proofErr w:type="gramEnd"/>
+      <w:r>
+        <w:rPr>
+          <w:b/>
+          <w:bCs/>
+        </w:rPr>
+        <w:t xml:space="preserve"> Contour Map”</w:t>
       </w:r>
     </w:p>
     <w:p>
@@ -1387,6 +1436,232 @@
           </wp:inline>
         </w:drawing>
       </w:r>
+    </w:p>
+    <w:p>
+      <w:pPr>
+        <w:pStyle w:val="Heading2"/>
+        <w:rPr>
+          <w:vanish/>
+        </w:rPr>
+      </w:pPr>
+      <w:r>
+        <w:lastRenderedPageBreak/>
+        <w:t xml:space="preserve">Ensemble </w:t>
+      </w:r>
+      <w:r>
+        <w:t>Parameter Histogram</w:t>
+      </w:r>
+    </w:p>
+    <w:p/>
+    <w:p>
+      <w:pPr>
+        <w:pStyle w:val="Heading4"/>
+      </w:pPr>
+      <w:r>
+        <w:t xml:space="preserve">Objective: </w:t>
+      </w:r>
+      <w:r>
+        <w:t>Investigate and compare histograms for ensemble parameters</w:t>
+      </w:r>
+    </w:p>
+    <w:p>
+      <w:pPr>
+        <w:numPr>
+          <w:ilvl w:val="0"/>
+          <w:numId w:val="47"/>
+        </w:numPr>
+        <w:contextualSpacing/>
+      </w:pPr>
+      <w:r>
+        <w:t>Import a Summary Ensemble, and use import path "</w:t>
+      </w:r>
+      <w:r>
+        <w:t>model-data/</w:t>
+      </w:r>
+      <w:proofErr w:type="spellStart"/>
+      <w:r>
+        <w:t>reek_ensemble</w:t>
+      </w:r>
+      <w:proofErr w:type="spellEnd"/>
+      <w:r>
+        <w:t>/3_r001_reek_50/realization-*/iter-1”</w:t>
+      </w:r>
+    </w:p>
+    <w:p>
+      <w:pPr>
+        <w:numPr>
+          <w:ilvl w:val="0"/>
+          <w:numId w:val="47"/>
+        </w:numPr>
+        <w:contextualSpacing/>
+      </w:pPr>
+      <w:r>
+        <w:t>From the right-click menu of Histogram Plots, select “New Histogram Plot-&gt;Ensemble Parameter”</w:t>
+      </w:r>
+      <w:r>
+        <w:br/>
+      </w:r>
+      <w:r>
+        <w:drawing>
+          <wp:inline distT="0" distB="0" distL="0" distR="0" wp14:anchorId="3FA17D12" wp14:editId="3F026B98">
+            <wp:extent cx="3408883" cy="990955"/>
+            <wp:effectExtent l="0" t="0" r="1270" b="0"/>
+            <wp:docPr id="1133120870" name="Picture 1" descr="A screenshot of a computer&#10;&#10;AI-generated content may be incorrect."/>
+            <wp:cNvGraphicFramePr>
+              <a:graphicFrameLocks xmlns:a="http://schemas.openxmlformats.org/drawingml/2006/main" noChangeAspect="1"/>
+            </wp:cNvGraphicFramePr>
+            <a:graphic xmlns:a="http://schemas.openxmlformats.org/drawingml/2006/main">
+              <a:graphicData uri="http://schemas.openxmlformats.org/drawingml/2006/picture">
+                <pic:pic xmlns:pic="http://schemas.openxmlformats.org/drawingml/2006/picture">
+                  <pic:nvPicPr>
+                    <pic:cNvPr id="1133120870" name="Picture 1" descr="A screenshot of a computer&#10;&#10;AI-generated content may be incorrect."/>
+                    <pic:cNvPicPr/>
+                  </pic:nvPicPr>
+                  <pic:blipFill>
+                    <a:blip r:embed="rId19"/>
+                    <a:stretch>
+                      <a:fillRect/>
+                    </a:stretch>
+                  </pic:blipFill>
+                  <pic:spPr>
+                    <a:xfrm>
+                      <a:off x="0" y="0"/>
+                      <a:ext cx="3427541" cy="996379"/>
+                    </a:xfrm>
+                    <a:prstGeom prst="rect">
+                      <a:avLst/>
+                    </a:prstGeom>
+                  </pic:spPr>
+                </pic:pic>
+              </a:graphicData>
+            </a:graphic>
+          </wp:inline>
+        </w:drawing>
+      </w:r>
+    </w:p>
+    <w:p>
+      <w:pPr>
+        <w:numPr>
+          <w:ilvl w:val="0"/>
+          <w:numId w:val="47"/>
+        </w:numPr>
+        <w:contextualSpacing/>
+      </w:pPr>
+      <w:r>
+        <w:t>Add more histograms from the right-click menu of the Plot</w:t>
+      </w:r>
+      <w:r>
+        <w:br/>
+      </w:r>
+      <w:r>
+        <w:drawing>
+          <wp:inline distT="0" distB="0" distL="0" distR="0" wp14:anchorId="29608DD6" wp14:editId="549B8470">
+            <wp:extent cx="3694176" cy="948962"/>
+            <wp:effectExtent l="0" t="0" r="1905" b="3810"/>
+            <wp:docPr id="568256755" name="Picture 1" descr="A screenshot of a computer&#10;&#10;AI-generated content may be incorrect."/>
+            <wp:cNvGraphicFramePr>
+              <a:graphicFrameLocks xmlns:a="http://schemas.openxmlformats.org/drawingml/2006/main" noChangeAspect="1"/>
+            </wp:cNvGraphicFramePr>
+            <a:graphic xmlns:a="http://schemas.openxmlformats.org/drawingml/2006/main">
+              <a:graphicData uri="http://schemas.openxmlformats.org/drawingml/2006/picture">
+                <pic:pic xmlns:pic="http://schemas.openxmlformats.org/drawingml/2006/picture">
+                  <pic:nvPicPr>
+                    <pic:cNvPr id="568256755" name="Picture 1" descr="A screenshot of a computer&#10;&#10;AI-generated content may be incorrect."/>
+                    <pic:cNvPicPr/>
+                  </pic:nvPicPr>
+                  <pic:blipFill>
+                    <a:blip r:embed="rId20"/>
+                    <a:stretch>
+                      <a:fillRect/>
+                    </a:stretch>
+                  </pic:blipFill>
+                  <pic:spPr>
+                    <a:xfrm>
+                      <a:off x="0" y="0"/>
+                      <a:ext cx="3715266" cy="954380"/>
+                    </a:xfrm>
+                    <a:prstGeom prst="rect">
+                      <a:avLst/>
+                    </a:prstGeom>
+                  </pic:spPr>
+                </pic:pic>
+              </a:graphicData>
+            </a:graphic>
+          </wp:inline>
+        </w:drawing>
+      </w:r>
+    </w:p>
+    <w:p>
+      <w:pPr>
+        <w:pStyle w:val="ListParagraph"/>
+        <w:numPr>
+          <w:ilvl w:val="0"/>
+          <w:numId w:val="47"/>
+        </w:numPr>
+      </w:pPr>
+      <w:r>
+        <w:t xml:space="preserve">Drag and drop is supported from the </w:t>
+      </w:r>
+      <w:r>
+        <w:rPr>
+          <w:b/>
+          <w:bCs/>
+        </w:rPr>
+        <w:t>Data Sources</w:t>
+      </w:r>
+      <w:r>
+        <w:t xml:space="preserve"> tree view</w:t>
+      </w:r>
+      <w:r>
+        <w:br/>
+      </w:r>
+    </w:p>
+    <w:p>
+      <w:pPr>
+        <w:pStyle w:val="ListParagraph"/>
+      </w:pPr>
+      <w:r>
+        <w:drawing>
+          <wp:inline distT="0" distB="0" distL="0" distR="0" wp14:anchorId="07C9703F" wp14:editId="63A07701">
+            <wp:extent cx="2502646" cy="2006839"/>
+            <wp:effectExtent l="0" t="0" r="0" b="0"/>
+            <wp:docPr id="507729806" name="Picture 1" descr="A screenshot of a computer&#10;&#10;AI-generated content may be incorrect."/>
+            <wp:cNvGraphicFramePr>
+              <a:graphicFrameLocks xmlns:a="http://schemas.openxmlformats.org/drawingml/2006/main" noChangeAspect="1"/>
+            </wp:cNvGraphicFramePr>
+            <a:graphic xmlns:a="http://schemas.openxmlformats.org/drawingml/2006/main">
+              <a:graphicData uri="http://schemas.openxmlformats.org/drawingml/2006/picture">
+                <pic:pic xmlns:pic="http://schemas.openxmlformats.org/drawingml/2006/picture">
+                  <pic:nvPicPr>
+                    <pic:cNvPr id="507729806" name="Picture 1" descr="A screenshot of a computer&#10;&#10;AI-generated content may be incorrect."/>
+                    <pic:cNvPicPr/>
+                  </pic:nvPicPr>
+                  <pic:blipFill>
+                    <a:blip r:embed="rId21"/>
+                    <a:stretch>
+                      <a:fillRect/>
+                    </a:stretch>
+                  </pic:blipFill>
+                  <pic:spPr>
+                    <a:xfrm>
+                      <a:off x="0" y="0"/>
+                      <a:ext cx="2520435" cy="2021104"/>
+                    </a:xfrm>
+                    <a:prstGeom prst="rect">
+                      <a:avLst/>
+                    </a:prstGeom>
+                  </pic:spPr>
+                </pic:pic>
+              </a:graphicData>
+            </a:graphic>
+          </wp:inline>
+        </w:drawing>
+      </w:r>
+    </w:p>
+    <w:p>
+      <w:pPr>
+        <w:pStyle w:val="ListParagraph"/>
+      </w:pPr>
     </w:p>
     <w:p/>
     <w:sectPr>
@@ -1789,7 +2064,7 @@
       <w:t xml:space="preserve">          </w:t>
     </w:r>
     <w:r>
-      <w:t>May</w:t>
+      <w:t>Nov</w:t>
     </w:r>
     <w:r>
       <w:t xml:space="preserve"> </w:t>
@@ -5418,6 +5693,92 @@
     </w:lvl>
   </w:abstractNum>
   <w:abstractNum w:abstractNumId="39" w15:restartNumberingAfterBreak="0">
+    <w:nsid w:val="5B673816"/>
+    <w:multiLevelType w:val="hybridMultilevel"/>
+    <w:tmpl w:val="DDE059A8"/>
+    <w:lvl w:ilvl="0" w:tplc="FFFFFFFF">
+      <w:start w:val="1"/>
+      <w:numFmt w:val="decimal"/>
+      <w:lvlText w:val="%1."/>
+      <w:lvlJc w:val="left"/>
+      <w:pPr>
+        <w:ind w:left="720" w:hanging="360"/>
+      </w:pPr>
+    </w:lvl>
+    <w:lvl w:ilvl="1" w:tplc="FFFFFFFF">
+      <w:start w:val="1"/>
+      <w:numFmt w:val="lowerLetter"/>
+      <w:lvlText w:val="%2."/>
+      <w:lvlJc w:val="left"/>
+      <w:pPr>
+        <w:ind w:left="1440" w:hanging="360"/>
+      </w:pPr>
+    </w:lvl>
+    <w:lvl w:ilvl="2" w:tplc="FFFFFFFF" w:tentative="1">
+      <w:start w:val="1"/>
+      <w:numFmt w:val="lowerRoman"/>
+      <w:lvlText w:val="%3."/>
+      <w:lvlJc w:val="right"/>
+      <w:pPr>
+        <w:ind w:left="2160" w:hanging="180"/>
+      </w:pPr>
+    </w:lvl>
+    <w:lvl w:ilvl="3" w:tplc="FFFFFFFF" w:tentative="1">
+      <w:start w:val="1"/>
+      <w:numFmt w:val="decimal"/>
+      <w:lvlText w:val="%4."/>
+      <w:lvlJc w:val="left"/>
+      <w:pPr>
+        <w:ind w:left="2880" w:hanging="360"/>
+      </w:pPr>
+    </w:lvl>
+    <w:lvl w:ilvl="4" w:tplc="FFFFFFFF" w:tentative="1">
+      <w:start w:val="1"/>
+      <w:numFmt w:val="lowerLetter"/>
+      <w:lvlText w:val="%5."/>
+      <w:lvlJc w:val="left"/>
+      <w:pPr>
+        <w:ind w:left="3600" w:hanging="360"/>
+      </w:pPr>
+    </w:lvl>
+    <w:lvl w:ilvl="5" w:tplc="FFFFFFFF" w:tentative="1">
+      <w:start w:val="1"/>
+      <w:numFmt w:val="lowerRoman"/>
+      <w:lvlText w:val="%6."/>
+      <w:lvlJc w:val="right"/>
+      <w:pPr>
+        <w:ind w:left="4320" w:hanging="180"/>
+      </w:pPr>
+    </w:lvl>
+    <w:lvl w:ilvl="6" w:tplc="FFFFFFFF" w:tentative="1">
+      <w:start w:val="1"/>
+      <w:numFmt w:val="decimal"/>
+      <w:lvlText w:val="%7."/>
+      <w:lvlJc w:val="left"/>
+      <w:pPr>
+        <w:ind w:left="5040" w:hanging="360"/>
+      </w:pPr>
+    </w:lvl>
+    <w:lvl w:ilvl="7" w:tplc="FFFFFFFF" w:tentative="1">
+      <w:start w:val="1"/>
+      <w:numFmt w:val="lowerLetter"/>
+      <w:lvlText w:val="%8."/>
+      <w:lvlJc w:val="left"/>
+      <w:pPr>
+        <w:ind w:left="5760" w:hanging="360"/>
+      </w:pPr>
+    </w:lvl>
+    <w:lvl w:ilvl="8" w:tplc="FFFFFFFF" w:tentative="1">
+      <w:start w:val="1"/>
+      <w:numFmt w:val="lowerRoman"/>
+      <w:lvlText w:val="%9."/>
+      <w:lvlJc w:val="right"/>
+      <w:pPr>
+        <w:ind w:left="6480" w:hanging="180"/>
+      </w:pPr>
+    </w:lvl>
+  </w:abstractNum>
+  <w:abstractNum w:abstractNumId="40" w15:restartNumberingAfterBreak="0">
     <w:nsid w:val="5F340B04"/>
     <w:multiLevelType w:val="hybridMultilevel"/>
     <w:tmpl w:val="3FD8B8D0"/>
@@ -5506,7 +5867,7 @@
       </w:pPr>
     </w:lvl>
   </w:abstractNum>
-  <w:abstractNum w:abstractNumId="40" w15:restartNumberingAfterBreak="0">
+  <w:abstractNum w:abstractNumId="41" w15:restartNumberingAfterBreak="0">
     <w:nsid w:val="61AC44B9"/>
     <w:multiLevelType w:val="hybridMultilevel"/>
     <w:tmpl w:val="BF0A809C"/>
@@ -5595,7 +5956,7 @@
       </w:pPr>
     </w:lvl>
   </w:abstractNum>
-  <w:abstractNum w:abstractNumId="41" w15:restartNumberingAfterBreak="0">
+  <w:abstractNum w:abstractNumId="42" w15:restartNumberingAfterBreak="0">
     <w:nsid w:val="71790769"/>
     <w:multiLevelType w:val="hybridMultilevel"/>
     <w:tmpl w:val="BF0A809C"/>
@@ -5684,7 +6045,7 @@
       </w:pPr>
     </w:lvl>
   </w:abstractNum>
-  <w:abstractNum w:abstractNumId="42" w15:restartNumberingAfterBreak="0">
+  <w:abstractNum w:abstractNumId="43" w15:restartNumberingAfterBreak="0">
     <w:nsid w:val="793D6C10"/>
     <w:multiLevelType w:val="hybridMultilevel"/>
     <w:tmpl w:val="DDE059A8"/>
@@ -5770,7 +6131,7 @@
       </w:pPr>
     </w:lvl>
   </w:abstractNum>
-  <w:abstractNum w:abstractNumId="43" w15:restartNumberingAfterBreak="0">
+  <w:abstractNum w:abstractNumId="44" w15:restartNumberingAfterBreak="0">
     <w:nsid w:val="7B0370D7"/>
     <w:multiLevelType w:val="hybridMultilevel"/>
     <w:tmpl w:val="501470E4"/>
@@ -5859,7 +6220,7 @@
       </w:pPr>
     </w:lvl>
   </w:abstractNum>
-  <w:abstractNum w:abstractNumId="44" w15:restartNumberingAfterBreak="0">
+  <w:abstractNum w:abstractNumId="45" w15:restartNumberingAfterBreak="0">
     <w:nsid w:val="7DC37A47"/>
     <w:multiLevelType w:val="hybridMultilevel"/>
     <w:tmpl w:val="39166076"/>
@@ -5952,7 +6313,7 @@
     <w:abstractNumId w:val="20"/>
   </w:num>
   <w:num w:numId="2" w16cid:durableId="1512841941">
-    <w:abstractNumId w:val="44"/>
+    <w:abstractNumId w:val="45"/>
   </w:num>
   <w:num w:numId="3" w16cid:durableId="792669601">
     <w:abstractNumId w:val="1"/>
@@ -5970,13 +6331,13 @@
     <w:abstractNumId w:val="16"/>
   </w:num>
   <w:num w:numId="8" w16cid:durableId="674261114">
-    <w:abstractNumId w:val="41"/>
+    <w:abstractNumId w:val="42"/>
   </w:num>
   <w:num w:numId="9" w16cid:durableId="852762502">
     <w:abstractNumId w:val="18"/>
   </w:num>
   <w:num w:numId="10" w16cid:durableId="1003750296">
-    <w:abstractNumId w:val="40"/>
+    <w:abstractNumId w:val="41"/>
   </w:num>
   <w:num w:numId="11" w16cid:durableId="1217283661">
     <w:abstractNumId w:val="28"/>
@@ -6027,7 +6388,7 @@
     <w:abstractNumId w:val="14"/>
   </w:num>
   <w:num w:numId="27" w16cid:durableId="795491177">
-    <w:abstractNumId w:val="39"/>
+    <w:abstractNumId w:val="40"/>
   </w:num>
   <w:num w:numId="28" w16cid:durableId="1306081577">
     <w:abstractNumId w:val="25"/>
@@ -6045,7 +6406,7 @@
     <w:abstractNumId w:val="33"/>
   </w:num>
   <w:num w:numId="33" w16cid:durableId="1294020382">
-    <w:abstractNumId w:val="43"/>
+    <w:abstractNumId w:val="44"/>
   </w:num>
   <w:num w:numId="34" w16cid:durableId="912860957">
     <w:abstractNumId w:val="10"/>
@@ -6084,7 +6445,10 @@
     <w:abstractNumId w:val="3"/>
   </w:num>
   <w:num w:numId="46" w16cid:durableId="108553502">
-    <w:abstractNumId w:val="42"/>
+    <w:abstractNumId w:val="43"/>
+  </w:num>
+  <w:num w:numId="47" w16cid:durableId="1813056982">
+    <w:abstractNumId w:val="39"/>
   </w:num>
 </w:numbering>
 </file>

</xml_diff>